<commit_message>
Guía del alumno: punto de acceso, modos de radio y diagnósticos nuevos
- Sección nueva "Wi-Fi: router inalámbrico y punto de acceso" con la
  diferencia entre crear una subred (R1) y extenderla al aire (AP-Admin).
- Tabla de códigos: D15 incluye el punto de acceso; se suman D18, D19,
  D20 y D23.
- Pantalla y recorrido actualizados al rediseño: celular, modo
  presentación, recorrido a la izquierda y diagnóstico con "Ir a
  configurar" a la derecha (SRE-735).

Co-Authored-By: Claude Opus 5.5 <noreply@anthropic.com>
</commit_message>
<xml_diff>
--- a/Guia_rapida_simulador_alumno.docx
+++ b/Guia_rapida_simulador_alumno.docx
@@ -140,7 +140,7 @@
                 <w:sz w:val="21"/>
                 <w:szCs w:val="21"/>
               </w:rPr>
-              <w:t xml:space="preserve">. Se abre con doble clic en cualquier navegador. No hay que instalar nada, no necesita internet y funciona igual en tu notebook, en la VM del laboratorio o en el celular.</w:t>
+              <w:t xml:space="preserve">. Se abre con doble clic en cualquier navegador. No hay que instalar nada, no necesita internet y funciona igual en tu notebook, en la VM del laboratorio o en el celular. En el celular, los paneles se abren desde abajo con los botones Agregar, Configurar y Ping.</w:t>
             </w:r>
           </w:p>
           <w:p>
@@ -450,7 +450,7 @@
                 <w:sz w:val="18"/>
                 <w:szCs w:val="18"/>
               </w:rPr>
-              <w:t xml:space="preserve">La red. Cada equipo muestra sus puertos como cuadraditos en el borde: los cables salen de ahí. Debajo de cada equipo ves su IP y su gateway.</w:t>
+              <w:t xml:space="preserve">La red. Cada equipo muestra sus puertos como cuadraditos en el borde: los cables salen de ahí. Debajo de cada equipo ves su IP y su gateway; los routers muestran una IP por cada red que conectan.</w:t>
             </w:r>
           </w:p>
         </w:tc>
@@ -509,7 +509,7 @@
                 <w:sz w:val="18"/>
                 <w:szCs w:val="18"/>
               </w:rPr>
-              <w:t xml:space="preserve">La configuración del equipo que tengas seleccionado: IP, máscara, gateway, y el interruptor para habilitar o deshabilitar cada interfaz.</w:t>
+              <w:t xml:space="preserve">La configuración del equipo que tengas seleccionado: IP, máscara, gateway, y el interruptor para habilitar o deshabilitar cada interfaz y, en las inalámbricas, el modo de radio (ap, cliente o bridge).</w:t>
             </w:r>
           </w:p>
         </w:tc>
@@ -568,7 +568,7 @@
                 <w:sz w:val="18"/>
                 <w:szCs w:val="18"/>
               </w:rPr>
-              <w:t xml:space="preserve">Cuatro pestañas: Simulación (el ping), DHCP, Cálculo de subred y Ayuda.</w:t>
+              <w:t xml:space="preserve">Cuatro pestañas: Simulación (el ping), DHCP, Cálculo de subred y Ayuda. Con la tecla F (modo presentación) queda reducida a una línea para proyectar.</w:t>
             </w:r>
           </w:p>
         </w:tc>
@@ -718,7 +718,7 @@
           <w:sz w:val="21"/>
           <w:szCs w:val="21"/>
         </w:rPr>
-        <w:t xml:space="preserve">El simulador no te dice sólo que falló. A la derecha de la consola tenés el recorrido paso a paso: cada cosa que el sistema operativo verifica antes de mandar el paquete, y cuál de esos pasos se rompió. Debajo aparece el diagnóstico con un código, una explicación y qué revisar.</w:t>
+        <w:t xml:space="preserve">El simulador no te dice sólo que falló. A la izquierda tenés el recorrido paso a paso: cada cosa que el sistema operativo verifica antes de mandar el paquete, y cuál de esos pasos se rompió, con la cuenta que dio mal. A la derecha aparece el diagnóstico con un código, una explicación, una sugerencia y el botón «Ir a configurar», que te lleva al equipo. «Ver los pasos» muestra el detalle completo.</w:t>
       </w:r>
     </w:p>
     <w:p>
@@ -1514,7 +1514,7 @@
                 <w:sz w:val="17"/>
                 <w:szCs w:val="17"/>
               </w:rPr>
-              <w:t xml:space="preserve">Están en el mismo switch pero en subredes distintas</w:t>
+              <w:t xml:space="preserve">Están en el mismo switch o punto de acceso pero en subredes distintas</w:t>
             </w:r>
           </w:p>
         </w:tc>
@@ -1541,7 +1541,353 @@
                 <w:sz w:val="17"/>
                 <w:szCs w:val="17"/>
               </w:rPr>
-              <w:t xml:space="preserve">Un switch no enruta: hace falta un router</w:t>
+              <w:t xml:space="preserve">Ni un switch ni un punto de acceso enrutan: hace falta un router</w:t>
+            </w:r>
+          </w:p>
+        </w:tc>
+      </w:tr>
+      <w:tr>
+        <w:trPr>
+          <w:trHeight w:val="300" w:hRule="atLeast"/>
+        </w:trPr>
+        <w:tc>
+          <w:tcPr>
+            <w:tcW w:type="dxa" w:w="1000"/>
+            <w:tcMar>
+              <w:top w:type="dxa" w:w="60"/>
+              <w:left w:type="dxa" w:w="100"/>
+              <w:bottom w:type="dxa" w:w="60"/>
+              <w:right w:type="dxa" w:w="100"/>
+            </w:tcMar>
+            <w:vAlign w:val="center"/>
+          </w:tcPr>
+          <w:p>
+            <w:pPr>
+              <w:spacing w:after="40" w:before="40" w:line="264"/>
+              <w:jc w:val="left"/>
+            </w:pPr>
+            <w:r>
+              <w:rPr>
+                <w:rFonts w:ascii="Consolas" w:cs="Consolas" w:eastAsia="Consolas" w:hAnsi="Consolas"/>
+                <w:b/>
+                <w:bCs/>
+                <w:sz w:val="17"/>
+                <w:szCs w:val="17"/>
+              </w:rPr>
+              <w:t xml:space="preserve">D18</w:t>
+            </w:r>
+          </w:p>
+        </w:tc>
+        <w:tc>
+          <w:tcPr>
+            <w:tcW w:type="dxa" w:w="4600"/>
+            <w:tcMar>
+              <w:top w:type="dxa" w:w="60"/>
+              <w:left w:type="dxa" w:w="100"/>
+              <w:bottom w:type="dxa" w:w="60"/>
+              <w:right w:type="dxa" w:w="100"/>
+            </w:tcMar>
+            <w:vAlign w:val="center"/>
+          </w:tcPr>
+          <w:p>
+            <w:pPr>
+              <w:spacing w:after="40" w:before="40" w:line="264"/>
+              <w:jc w:val="left"/>
+            </w:pPr>
+            <w:r>
+              <w:rPr>
+                <w:rFonts w:ascii="Calibri" w:cs="Calibri" w:eastAsia="Calibri" w:hAnsi="Calibri"/>
+                <w:sz w:val="17"/>
+                <w:szCs w:val="17"/>
+              </w:rPr>
+              <w:t xml:space="preserve">Dos equipos en modo cliente enlazados entre sí</w:t>
+            </w:r>
+          </w:p>
+        </w:tc>
+        <w:tc>
+          <w:tcPr>
+            <w:tcW w:type="dxa" w:w="3400"/>
+            <w:tcMar>
+              <w:top w:type="dxa" w:w="60"/>
+              <w:left w:type="dxa" w:w="100"/>
+              <w:bottom w:type="dxa" w:w="60"/>
+              <w:right w:type="dxa" w:w="100"/>
+            </w:tcMar>
+            <w:vAlign w:val="center"/>
+          </w:tcPr>
+          <w:p>
+            <w:pPr>
+              <w:spacing w:after="40" w:before="40" w:line="264"/>
+              <w:jc w:val="left"/>
+            </w:pPr>
+            <w:r>
+              <w:rPr>
+                <w:rFonts w:ascii="Calibri" w:cs="Calibri" w:eastAsia="Calibri" w:hAnsi="Calibri"/>
+                <w:sz w:val="17"/>
+                <w:szCs w:val="17"/>
+              </w:rPr>
+              <w:t xml:space="preserve">Un cliente se asocia a un punto de acceso, no a otro cliente</w:t>
+            </w:r>
+          </w:p>
+        </w:tc>
+      </w:tr>
+      <w:tr>
+        <w:trPr>
+          <w:trHeight w:val="300" w:hRule="atLeast"/>
+        </w:trPr>
+        <w:tc>
+          <w:tcPr>
+            <w:tcW w:type="dxa" w:w="1000"/>
+            <w:shd w:fill="F2F2F2" w:color="auto" w:val="clear"/>
+            <w:tcMar>
+              <w:top w:type="dxa" w:w="60"/>
+              <w:left w:type="dxa" w:w="100"/>
+              <w:bottom w:type="dxa" w:w="60"/>
+              <w:right w:type="dxa" w:w="100"/>
+            </w:tcMar>
+            <w:vAlign w:val="center"/>
+          </w:tcPr>
+          <w:p>
+            <w:pPr>
+              <w:spacing w:after="40" w:before="40" w:line="264"/>
+              <w:jc w:val="left"/>
+            </w:pPr>
+            <w:r>
+              <w:rPr>
+                <w:rFonts w:ascii="Consolas" w:cs="Consolas" w:eastAsia="Consolas" w:hAnsi="Consolas"/>
+                <w:b/>
+                <w:bCs/>
+                <w:sz w:val="17"/>
+                <w:szCs w:val="17"/>
+              </w:rPr>
+              <w:t xml:space="preserve">D19</w:t>
+            </w:r>
+          </w:p>
+        </w:tc>
+        <w:tc>
+          <w:tcPr>
+            <w:tcW w:type="dxa" w:w="4600"/>
+            <w:shd w:fill="F2F2F2" w:color="auto" w:val="clear"/>
+            <w:tcMar>
+              <w:top w:type="dxa" w:w="60"/>
+              <w:left w:type="dxa" w:w="100"/>
+              <w:bottom w:type="dxa" w:w="60"/>
+              <w:right w:type="dxa" w:w="100"/>
+            </w:tcMar>
+            <w:vAlign w:val="center"/>
+          </w:tcPr>
+          <w:p>
+            <w:pPr>
+              <w:spacing w:after="40" w:before="40" w:line="264"/>
+              <w:jc w:val="left"/>
+            </w:pPr>
+            <w:r>
+              <w:rPr>
+                <w:rFonts w:ascii="Calibri" w:cs="Calibri" w:eastAsia="Calibri" w:hAnsi="Calibri"/>
+                <w:sz w:val="17"/>
+                <w:szCs w:val="17"/>
+              </w:rPr>
+              <w:t xml:space="preserve">Tu equipo inalámbrico no tiene punto de acceso</w:t>
+            </w:r>
+          </w:p>
+        </w:tc>
+        <w:tc>
+          <w:tcPr>
+            <w:tcW w:type="dxa" w:w="3400"/>
+            <w:shd w:fill="F2F2F2" w:color="auto" w:val="clear"/>
+            <w:tcMar>
+              <w:top w:type="dxa" w:w="60"/>
+              <w:left w:type="dxa" w:w="100"/>
+              <w:bottom w:type="dxa" w:w="60"/>
+              <w:right w:type="dxa" w:w="100"/>
+            </w:tcMar>
+            <w:vAlign w:val="center"/>
+          </w:tcPr>
+          <w:p>
+            <w:pPr>
+              <w:spacing w:after="40" w:before="40" w:line="264"/>
+              <w:jc w:val="left"/>
+            </w:pPr>
+            <w:r>
+              <w:rPr>
+                <w:rFonts w:ascii="Calibri" w:cs="Calibri" w:eastAsia="Calibri" w:hAnsi="Calibri"/>
+                <w:sz w:val="17"/>
+                <w:szCs w:val="17"/>
+              </w:rPr>
+              <w:t xml:space="preserve">Que el AP esté encendido y con wlan0 en modo ap</w:t>
+            </w:r>
+          </w:p>
+        </w:tc>
+      </w:tr>
+      <w:tr>
+        <w:trPr>
+          <w:trHeight w:val="300" w:hRule="atLeast"/>
+        </w:trPr>
+        <w:tc>
+          <w:tcPr>
+            <w:tcW w:type="dxa" w:w="1000"/>
+            <w:tcMar>
+              <w:top w:type="dxa" w:w="60"/>
+              <w:left w:type="dxa" w:w="100"/>
+              <w:bottom w:type="dxa" w:w="60"/>
+              <w:right w:type="dxa" w:w="100"/>
+            </w:tcMar>
+            <w:vAlign w:val="center"/>
+          </w:tcPr>
+          <w:p>
+            <w:pPr>
+              <w:spacing w:after="40" w:before="40" w:line="264"/>
+              <w:jc w:val="left"/>
+            </w:pPr>
+            <w:r>
+              <w:rPr>
+                <w:rFonts w:ascii="Consolas" w:cs="Consolas" w:eastAsia="Consolas" w:hAnsi="Consolas"/>
+                <w:b/>
+                <w:bCs/>
+                <w:sz w:val="17"/>
+                <w:szCs w:val="17"/>
+              </w:rPr>
+              <w:t xml:space="preserve">D20</w:t>
+            </w:r>
+          </w:p>
+        </w:tc>
+        <w:tc>
+          <w:tcPr>
+            <w:tcW w:type="dxa" w:w="4600"/>
+            <w:tcMar>
+              <w:top w:type="dxa" w:w="60"/>
+              <w:left w:type="dxa" w:w="100"/>
+              <w:bottom w:type="dxa" w:w="60"/>
+              <w:right w:type="dxa" w:w="100"/>
+            </w:tcMar>
+            <w:vAlign w:val="center"/>
+          </w:tcPr>
+          <w:p>
+            <w:pPr>
+              <w:spacing w:after="40" w:before="40" w:line="264"/>
+              <w:jc w:val="left"/>
+            </w:pPr>
+            <w:r>
+              <w:rPr>
+                <w:rFonts w:ascii="Calibri" w:cs="Calibri" w:eastAsia="Calibri" w:hAnsi="Calibri"/>
+                <w:sz w:val="17"/>
+                <w:szCs w:val="17"/>
+              </w:rPr>
+              <w:t xml:space="preserve">Nadie respondió en tu red con esa IP</w:t>
+            </w:r>
+          </w:p>
+        </w:tc>
+        <w:tc>
+          <w:tcPr>
+            <w:tcW w:type="dxa" w:w="3400"/>
+            <w:tcMar>
+              <w:top w:type="dxa" w:w="60"/>
+              <w:left w:type="dxa" w:w="100"/>
+              <w:bottom w:type="dxa" w:w="60"/>
+              <w:right w:type="dxa" w:w="100"/>
+            </w:tcMar>
+            <w:vAlign w:val="center"/>
+          </w:tcPr>
+          <w:p>
+            <w:pPr>
+              <w:spacing w:after="40" w:before="40" w:line="264"/>
+              <w:jc w:val="left"/>
+            </w:pPr>
+            <w:r>
+              <w:rPr>
+                <w:rFonts w:ascii="Calibri" w:cs="Calibri" w:eastAsia="Calibri" w:hAnsi="Calibri"/>
+                <w:sz w:val="17"/>
+                <w:szCs w:val="17"/>
+              </w:rPr>
+              <w:t xml:space="preserve">Que la IP de destino esté bien escrita y el equipo exista</w:t>
+            </w:r>
+          </w:p>
+        </w:tc>
+      </w:tr>
+      <w:tr>
+        <w:trPr>
+          <w:trHeight w:val="300" w:hRule="atLeast"/>
+        </w:trPr>
+        <w:tc>
+          <w:tcPr>
+            <w:tcW w:type="dxa" w:w="1000"/>
+            <w:shd w:fill="F2F2F2" w:color="auto" w:val="clear"/>
+            <w:tcMar>
+              <w:top w:type="dxa" w:w="60"/>
+              <w:left w:type="dxa" w:w="100"/>
+              <w:bottom w:type="dxa" w:w="60"/>
+              <w:right w:type="dxa" w:w="100"/>
+            </w:tcMar>
+            <w:vAlign w:val="center"/>
+          </w:tcPr>
+          <w:p>
+            <w:pPr>
+              <w:spacing w:after="40" w:before="40" w:line="264"/>
+              <w:jc w:val="left"/>
+            </w:pPr>
+            <w:r>
+              <w:rPr>
+                <w:rFonts w:ascii="Consolas" w:cs="Consolas" w:eastAsia="Consolas" w:hAnsi="Consolas"/>
+                <w:b/>
+                <w:bCs/>
+                <w:sz w:val="17"/>
+                <w:szCs w:val="17"/>
+              </w:rPr>
+              <w:t xml:space="preserve">D23</w:t>
+            </w:r>
+          </w:p>
+        </w:tc>
+        <w:tc>
+          <w:tcPr>
+            <w:tcW w:type="dxa" w:w="4600"/>
+            <w:shd w:fill="F2F2F2" w:color="auto" w:val="clear"/>
+            <w:tcMar>
+              <w:top w:type="dxa" w:w="60"/>
+              <w:left w:type="dxa" w:w="100"/>
+              <w:bottom w:type="dxa" w:w="60"/>
+              <w:right w:type="dxa" w:w="100"/>
+            </w:tcMar>
+            <w:vAlign w:val="center"/>
+          </w:tcPr>
+          <w:p>
+            <w:pPr>
+              <w:spacing w:after="40" w:before="40" w:line="264"/>
+              <w:jc w:val="left"/>
+            </w:pPr>
+            <w:r>
+              <w:rPr>
+                <w:rFonts w:ascii="Calibri" w:cs="Calibri" w:eastAsia="Calibri" w:hAnsi="Calibri"/>
+                <w:sz w:val="17"/>
+                <w:szCs w:val="17"/>
+              </w:rPr>
+              <w:t xml:space="preserve">El paquete dio vueltas entre routers hasta agotar el TTL</w:t>
+            </w:r>
+          </w:p>
+        </w:tc>
+        <w:tc>
+          <w:tcPr>
+            <w:tcW w:type="dxa" w:w="3400"/>
+            <w:shd w:fill="F2F2F2" w:color="auto" w:val="clear"/>
+            <w:tcMar>
+              <w:top w:type="dxa" w:w="60"/>
+              <w:left w:type="dxa" w:w="100"/>
+              <w:bottom w:type="dxa" w:w="60"/>
+              <w:right w:type="dxa" w:w="100"/>
+            </w:tcMar>
+            <w:vAlign w:val="center"/>
+          </w:tcPr>
+          <w:p>
+            <w:pPr>
+              <w:spacing w:after="40" w:before="40" w:line="264"/>
+              <w:jc w:val="left"/>
+            </w:pPr>
+            <w:r>
+              <w:rPr>
+                <w:rFonts w:ascii="Calibri" w:cs="Calibri" w:eastAsia="Calibri" w:hAnsi="Calibri"/>
+                <w:sz w:val="17"/>
+                <w:szCs w:val="17"/>
+              </w:rPr>
+              <w:t xml:space="preserve">La ruta hacia ese destino en cada router del recorrido</w:t>
             </w:r>
           </w:p>
         </w:tc>
@@ -1611,6 +1957,68 @@
           <w:szCs w:val="21"/>
         </w:rPr>
         <w:t xml:space="preserve">: muestra el AND de tu IP y el AND de tu gateway, uno debajo del otro. Si los dos resultados no son iguales, tu equipo no puede hablar con su propio gateway, y ahí está el problema. Ese cálculo es el mismo que hacés a mano en el TP.</w:t>
+      </w:r>
+    </w:p>
+    <w:p>
+      <w:pPr>
+        <w:pStyle w:val="Heading1"/>
+        <w:pBdr>
+          <w:bottom w:val="single" w:color="1F3864" w:sz="10" w:space="4"/>
+        </w:pBdr>
+        <w:spacing w:after="140" w:before="320"/>
+      </w:pPr>
+      <w:r>
+        <w:rPr>
+          <w:rFonts w:ascii="Calibri" w:cs="Calibri" w:eastAsia="Calibri" w:hAnsi="Calibri"/>
+          <w:b/>
+          <w:bCs/>
+          <w:color w:val="1F3864"/>
+          <w:sz w:val="28"/>
+          <w:szCs w:val="28"/>
+        </w:rPr>
+        <w:t xml:space="preserve">Wi-Fi: router inalámbrico y punto de acceso</w:t>
+      </w:r>
+    </w:p>
+    <w:p>
+      <w:pPr>
+        <w:spacing w:after="100" w:before="60" w:line="264"/>
+        <w:jc w:val="left"/>
+      </w:pPr>
+      <w:r>
+        <w:rPr>
+          <w:rFonts w:ascii="Calibri" w:cs="Calibri" w:eastAsia="Calibri" w:hAnsi="Calibri"/>
+          <w:sz w:val="21"/>
+          <w:szCs w:val="21"/>
+        </w:rPr>
+        <w:t xml:space="preserve">Cada interfaz inalámbrica tiene un modo de radio, que elegís en la pestaña Interfaces del panel derecho. En modo ap sostiene la red Wi-Fi (la celda) y admite varios clientes; en modo cliente se asocia a un ap; en modo bridge une dos puntos a distancia. Dos clientes no se conectan entre sí: siempre hace falta un ap.</w:t>
+      </w:r>
+    </w:p>
+    <w:p>
+      <w:pPr>
+        <w:spacing w:after="100" w:before="60" w:line="264"/>
+        <w:jc w:val="left"/>
+      </w:pPr>
+      <w:r>
+        <w:rPr>
+          <w:rFonts w:ascii="Calibri" w:cs="Calibri" w:eastAsia="Calibri" w:hAnsi="Calibri"/>
+          <w:sz w:val="21"/>
+          <w:szCs w:val="21"/>
+        </w:rPr>
+        <w:t xml:space="preserve">En el ejemplo Complejo turístico vas a ver los dos usos. R1 es un router inalámbrico: su wlan0 en modo ap crea una subred nueva (10.45.7.0/26) para los huéspedes, y R1 enruta entre esa red y las demás. AP-Admin es un punto de acceso: cuelga del switch de Administración y extiende al aire una subred que ya existía (10.45.7.64/27). Un AP no enruta, igual que un switch.</w:t>
+      </w:r>
+    </w:p>
+    <w:p>
+      <w:pPr>
+        <w:spacing w:after="100" w:before="60" w:line="264"/>
+        <w:jc w:val="left"/>
+      </w:pPr>
+      <w:r>
+        <w:rPr>
+          <w:rFonts w:ascii="Calibri" w:cs="Calibri" w:eastAsia="Calibri" w:hAnsi="Calibri"/>
+          <w:sz w:val="21"/>
+          <w:szCs w:val="21"/>
+        </w:rPr>
+        <w:t xml:space="preserve">El alcance es limitado: si alejás un cliente de su punto de acceso, el ping falla con D17.</w:t>
       </w:r>
     </w:p>
     <w:p>

</xml_diff>

<commit_message>
Reglas de filtrado en el router (D27) y aislamiento de huéspedes
Los routers tienen una lista ordenada de reglas sin estado (bloquear o
permitir entre dos redes CIDR): gana la primera que coincide y lo que no
coincide pasa. Se revisan sólo en el tráfico que el router reenvía. Un
bloqueo, a la ida o en la respuesta, da el diagnóstico D27, que nombra la
regla. Pestaña Filtrado en el panel del router.

Los objetivos pueden exigir la causa de una falla (codigo) y traer una
descripción para el alumno. El escenario del punto 6 de la práctica
Termal aísla a los huéspedes con una regla en R-Central.

SRE-988

Co-Authored-By: Claude Opus 5.5 <noreply@anthropic.com>
</commit_message>
<xml_diff>
--- a/Guia_rapida_simulador_alumno.docx
+++ b/Guia_rapida_simulador_alumno.docx
@@ -1888,6 +1888,94 @@
                 <w:szCs w:val="17"/>
               </w:rPr>
               <w:t xml:space="preserve">La ruta hacia ese destino en cada router del recorrido</w:t>
+            </w:r>
+          </w:p>
+        </w:tc>
+      </w:tr>
+      <w:tr>
+        <w:trPr>
+          <w:trHeight w:val="300" w:hRule="atLeast"/>
+        </w:trPr>
+        <w:tc>
+          <w:tcPr>
+            <w:tcW w:type="dxa" w:w="1000"/>
+            <w:shd w:fill="F2F2F2" w:color="auto" w:val="clear"/>
+            <w:tcMar>
+              <w:top w:type="dxa" w:w="60"/>
+              <w:left w:type="dxa" w:w="100"/>
+              <w:bottom w:type="dxa" w:w="60"/>
+              <w:right w:type="dxa" w:w="100"/>
+            </w:tcMar>
+            <w:vAlign w:val="center"/>
+          </w:tcPr>
+          <w:p>
+            <w:pPr>
+              <w:spacing w:after="40" w:before="40" w:line="264"/>
+              <w:jc w:val="left"/>
+            </w:pPr>
+            <w:r>
+              <w:rPr>
+                <w:rFonts w:ascii="Consolas" w:cs="Consolas" w:eastAsia="Consolas" w:hAnsi="Consolas"/>
+                <w:b/>
+                <w:bCs/>
+                <w:sz w:val="17"/>
+                <w:szCs w:val="17"/>
+              </w:rPr>
+              <w:t xml:space="preserve">D27</w:t>
+            </w:r>
+          </w:p>
+        </w:tc>
+        <w:tc>
+          <w:tcPr>
+            <w:tcW w:type="dxa" w:w="4600"/>
+            <w:shd w:fill="F2F2F2" w:color="auto" w:val="clear"/>
+            <w:tcMar>
+              <w:top w:type="dxa" w:w="60"/>
+              <w:left w:type="dxa" w:w="100"/>
+              <w:bottom w:type="dxa" w:w="60"/>
+              <w:right w:type="dxa" w:w="100"/>
+            </w:tcMar>
+            <w:vAlign w:val="center"/>
+          </w:tcPr>
+          <w:p>
+            <w:pPr>
+              <w:spacing w:after="40" w:before="40" w:line="264"/>
+              <w:jc w:val="left"/>
+            </w:pPr>
+            <w:r>
+              <w:rPr>
+                <w:rFonts w:ascii="Calibri" w:cs="Calibri" w:eastAsia="Calibri" w:hAnsi="Calibri"/>
+                <w:sz w:val="17"/>
+                <w:szCs w:val="17"/>
+              </w:rPr>
+              <w:t xml:space="preserve">Una regla de filtrado del router bloqueó el paquete</w:t>
+            </w:r>
+          </w:p>
+        </w:tc>
+        <w:tc>
+          <w:tcPr>
+            <w:tcW w:type="dxa" w:w="3400"/>
+            <w:shd w:fill="F2F2F2" w:color="auto" w:val="clear"/>
+            <w:tcMar>
+              <w:top w:type="dxa" w:w="60"/>
+              <w:left w:type="dxa" w:w="100"/>
+              <w:bottom w:type="dxa" w:w="60"/>
+              <w:right w:type="dxa" w:w="100"/>
+            </w:tcMar>
+            <w:vAlign w:val="center"/>
+          </w:tcPr>
+          <w:p>
+            <w:pPr>
+              <w:spacing w:after="40" w:before="40" w:line="264"/>
+              <w:jc w:val="left"/>
+            </w:pPr>
+            <w:r>
+              <w:rPr>
+                <w:rFonts w:ascii="Calibri" w:cs="Calibri" w:eastAsia="Calibri" w:hAnsi="Calibri"/>
+                <w:sz w:val="17"/>
+                <w:szCs w:val="17"/>
+              </w:rPr>
+              <w:t xml:space="preserve">Pestaña Filtrado del router: el orden de las reglas</w:t>
             </w:r>
           </w:p>
         </w:tc>

</xml_diff>

<commit_message>
Mensajes en lenguaje natural, con nombres visibles y sin jerga interna
Aplica el borrador aprobado en docs/revision-mensajes.md:
- Los diagnósticos explican qué pasó, por qué impide el ping y qué
  revisar, sin códigos dentro del texto. La sugerencia puede depender
  del contexto. D12 y D26 dicen la causa en palabras.
- Los pasos del recorrido van en infinitivo y nombran a los equipos y
  cables por su nombre visible. La primera línea del detalle es la
  cuenta y la última, la conclusión.
- El código D pasa a ser una etiqueta chica junto al título.
- "Puerta de enlace" en lugar de "gateway", distancias en metros y
  avisos del modo Docente dirigidos al alumno.
- Validación al importar y hallazgos del Desafío reescritos.
- Guía del alumno y especificaciones alineadas.

SRE-989

Co-Authored-By: Claude Opus 5.5 <noreply@anthropic.com>
</commit_message>
<xml_diff>
--- a/Guia_rapida_simulador_alumno.docx
+++ b/Guia_rapida_simulador_alumno.docx
@@ -450,7 +450,7 @@
                 <w:sz w:val="18"/>
                 <w:szCs w:val="18"/>
               </w:rPr>
-              <w:t xml:space="preserve">La red. Cada equipo muestra sus puertos como cuadraditos en el borde: los cables salen de ahí. Debajo de cada equipo ves su IP y su gateway; los routers muestran una IP por cada red que conectan.</w:t>
+              <w:t xml:space="preserve">La red. Cada equipo muestra sus puertos como cuadraditos en el borde: los cables salen de ahí. Debajo de cada equipo ves su IP y su puerta de enlace (la línea «gw»); los routers muestran una IP por cada red que conectan.</w:t>
             </w:r>
           </w:p>
         </w:tc>
@@ -509,7 +509,7 @@
                 <w:sz w:val="18"/>
                 <w:szCs w:val="18"/>
               </w:rPr>
-              <w:t xml:space="preserve">La configuración del equipo que tengas seleccionado: IP, máscara, gateway, y el interruptor para habilitar o deshabilitar cada interfaz y, en las inalámbricas, el modo de radio (ap, cliente o bridge).</w:t>
+              <w:t xml:space="preserve">La configuración del equipo que tengas seleccionado: IP, máscara, puerta de enlace, y el interruptor para habilitar o deshabilitar cada interfaz y, en las inalámbricas, el modo de radio (ap, cliente o bridge).</w:t>
             </w:r>
           </w:p>
         </w:tc>
@@ -616,7 +616,7 @@
           <w:sz w:val="21"/>
           <w:szCs w:val="21"/>
         </w:rPr>
-        <w:t xml:space="preserve">Conectar dos equipos: elegí el tipo de cable en la columna izquierda, hacé clic en un puerto libre del primer equipo y después en un puerto libre del segundo. Si el puerto se atenúa, ese cable no va ahí.</w:t>
+        <w:t xml:space="preserve">Conectar dos equipos: apretá «Conectar con un cable» en la columna izquierda, hacé clic en un puerto libre del primer equipo y después en un puerto libre del segundo. Si el puerto se atenúa, ese cable no va ahí.</w:t>
       </w:r>
     </w:p>
     <w:p>
@@ -718,7 +718,7 @@
           <w:sz w:val="21"/>
           <w:szCs w:val="21"/>
         </w:rPr>
-        <w:t xml:space="preserve">El simulador no te dice sólo que falló. A la izquierda tenés el recorrido paso a paso: cada cosa que el sistema operativo verifica antes de mandar el paquete, y cuál de esos pasos se rompió, con la cuenta que dio mal. A la derecha aparece el diagnóstico con un código, una explicación, una sugerencia y el botón «Ir a configurar», que te lleva al equipo. «Ver los pasos» muestra el detalle completo.</w:t>
+        <w:t xml:space="preserve">El simulador no te dice sólo que falló. A la izquierda tenés el recorrido paso a paso: cada cosa que el sistema operativo verifica antes de mandar el paquete, y cuál de esos pasos se rompió, con la cuenta que dio mal. A la derecha aparece el diagnóstico con un título (al lado, un código chico como D09 que podés buscar en la tabla de abajo), una explicación, una sugerencia y el botón «Ir a configurar», que te lleva al equipo. «Ver los pasos» muestra el detalle completo.</w:t>
       </w:r>
     </w:p>
     <w:p>
@@ -908,7 +908,7 @@
                 <w:sz w:val="17"/>
                 <w:szCs w:val="17"/>
               </w:rPr>
-              <w:t xml:space="preserve">La interfaz está deshabilitada</w:t>
+              <w:t xml:space="preserve">El equipo está apagado o su interfaz está deshabilitada</w:t>
             </w:r>
           </w:p>
         </w:tc>
@@ -995,7 +995,7 @@
                 <w:sz w:val="17"/>
                 <w:szCs w:val="17"/>
               </w:rPr>
-              <w:t xml:space="preserve">No hay cable, o el enlace está caído</w:t>
+              <w:t xml:space="preserve">No hay conexión física</w:t>
             </w:r>
           </w:p>
         </w:tc>
@@ -1022,7 +1022,7 @@
                 <w:sz w:val="17"/>
                 <w:szCs w:val="17"/>
               </w:rPr>
-              <w:t xml:space="preserve">Mirá el color del enlace en el lienzo</w:t>
+              <w:t xml:space="preserve">Mirá el color del cable en el lienzo</w:t>
             </w:r>
           </w:p>
         </w:tc>
@@ -1081,7 +1081,7 @@
                 <w:sz w:val="17"/>
                 <w:szCs w:val="17"/>
               </w:rPr>
-              <w:t xml:space="preserve">Dos equipos con la misma IP</w:t>
+              <w:t xml:space="preserve">Dos equipos tienen la misma IP</w:t>
             </w:r>
           </w:p>
         </w:tc>
@@ -1168,7 +1168,7 @@
                 <w:sz w:val="17"/>
                 <w:szCs w:val="17"/>
               </w:rPr>
-              <w:t xml:space="preserve">El destino está en otra subred y no cargaste gateway</w:t>
+              <w:t xml:space="preserve">Falta la puerta de enlace</w:t>
             </w:r>
           </w:p>
         </w:tc>
@@ -1254,7 +1254,7 @@
                 <w:sz w:val="17"/>
                 <w:szCs w:val="17"/>
               </w:rPr>
-              <w:t xml:space="preserve">Tu gateway quedó fuera de tu subred</w:t>
+              <w:t xml:space="preserve">La puerta de enlace está fuera de tu red</w:t>
             </w:r>
           </w:p>
         </w:tc>
@@ -1341,7 +1341,7 @@
                 <w:sz w:val="17"/>
                 <w:szCs w:val="17"/>
               </w:rPr>
-              <w:t xml:space="preserve">El router no sabe cómo llegar a esa red</w:t>
+              <w:t xml:space="preserve">El router no sabe cómo llegar al destino</w:t>
             </w:r>
           </w:p>
         </w:tc>
@@ -1427,7 +1427,7 @@
                 <w:sz w:val="17"/>
                 <w:szCs w:val="17"/>
               </w:rPr>
-              <w:t xml:space="preserve">El paquete llegó pero la respuesta no vuelve</w:t>
+              <w:t xml:space="preserve">La respuesta no puede volver</w:t>
             </w:r>
           </w:p>
         </w:tc>
@@ -1514,7 +1514,7 @@
                 <w:sz w:val="17"/>
                 <w:szCs w:val="17"/>
               </w:rPr>
-              <w:t xml:space="preserve">Están en el mismo switch o punto de acceso pero en subredes distintas</w:t>
+              <w:t xml:space="preserve">Están en el mismo switch (o punto de acceso), pero en subredes distintas</w:t>
             </w:r>
           </w:p>
         </w:tc>
@@ -1600,7 +1600,7 @@
                 <w:sz w:val="17"/>
                 <w:szCs w:val="17"/>
               </w:rPr>
-              <w:t xml:space="preserve">Dos equipos en modo cliente enlazados entre sí</w:t>
+              <w:t xml:space="preserve">Los modos de radio no son compatibles</w:t>
             </w:r>
           </w:p>
         </w:tc>
@@ -1687,7 +1687,7 @@
                 <w:sz w:val="17"/>
                 <w:szCs w:val="17"/>
               </w:rPr>
-              <w:t xml:space="preserve">Tu equipo inalámbrico no tiene punto de acceso</w:t>
+              <w:t xml:space="preserve">El equipo inalámbrico no está conectado a un punto de acceso</w:t>
             </w:r>
           </w:p>
         </w:tc>
@@ -1773,7 +1773,7 @@
                 <w:sz w:val="17"/>
                 <w:szCs w:val="17"/>
               </w:rPr>
-              <w:t xml:space="preserve">Nadie respondió en tu red con esa IP</w:t>
+              <w:t xml:space="preserve">Nadie tiene esa IP en tu red</w:t>
             </w:r>
           </w:p>
         </w:tc>
@@ -1860,7 +1860,7 @@
                 <w:sz w:val="17"/>
                 <w:szCs w:val="17"/>
               </w:rPr>
-              <w:t xml:space="preserve">El paquete dio vueltas entre routers hasta agotar el TTL</w:t>
+              <w:t xml:space="preserve">El paquete quedó dando vueltas entre routers</w:t>
             </w:r>
           </w:p>
         </w:tc>
@@ -2036,7 +2036,7 @@
           <w:sz w:val="21"/>
           <w:szCs w:val="21"/>
         </w:rPr>
-        <w:t xml:space="preserve">«¿Tu gateway está en tu subred?»</w:t>
+        <w:t xml:space="preserve">«¿Tu puerta de enlace (gateway) está en tu red?»</w:t>
       </w:r>
       <w:r>
         <w:rPr>
@@ -2044,7 +2044,7 @@
           <w:sz w:val="21"/>
           <w:szCs w:val="21"/>
         </w:rPr>
-        <w:t xml:space="preserve">: muestra el AND de tu IP y el AND de tu gateway, uno debajo del otro. Si los dos resultados no son iguales, tu equipo no puede hablar con su propio gateway, y ahí está el problema. Ese cálculo es el mismo que hacés a mano en el TP.</w:t>
+        <w:t xml:space="preserve">: muestra el AND de tu IP y el AND de tu puerta de enlace, uno debajo del otro. Si los dos resultados no son iguales, tu equipo no puede hablar con su propia puerta de enlace, y ahí está el problema. Ese cálculo es el mismo que hacés a mano en el TP.</w:t>
       </w:r>
     </w:p>
     <w:p>

</xml_diff>